<commit_message>
Host the tool on GitHub Pages and surface the live link
- Add index.html (redirect to the tool) and .nojekyll for static hosting
- Add prominent live-tool link to README (top + usage)
- Add clickable live-tool link to both documentation .docx files

Co-Authored-By: Claude Opus 4.8 <noreply@anthropic.com>
</commit_message>
<xml_diff>
--- a/docs/Calculations_Documentation.docx
+++ b/docs/Calculations_Documentation.docx
@@ -9,6 +9,23 @@
       <w:r>
         <w:t>Cardiac MRI Reference Converter — Calculations</w:t>
       </w:r>
+    </w:p>
+    <w:p>
+      <w:r>
+        <w:rPr>
+          <w:b/>
+        </w:rPr>
+        <w:t xml:space="preserve">Live tool (open in a browser): </w:t>
+      </w:r>
+      <w:hyperlink r:id="rId9">
+        <w:r>
+          <w:rPr>
+            <w:color w:val="0D7680"/>
+            <w:u w:val="single"/>
+          </w:rPr>
+          <w:t>https://nethahussain.github.io/cardiac-mri-reference-converter/</w:t>
+        </w:r>
+      </w:hyperlink>
     </w:p>
     <w:p>
       <w:r>

</xml_diff>